<commit_message>
docs(s09): agregar PDF, mensaje real del compilador y ajustes de portada e inventario
</commit_message>
<xml_diff>
--- a/docs/entrega/S09_ActividadAutonoma_RodriguezBazan.docx
+++ b/docs/entrega/S09_ActividadAutonoma_RodriguezBazan.docx
@@ -220,6 +220,38 @@
                 <w:b/>
                 <w:sz w:val="18"/>
               </w:rPr>
+              <w:t>Sesión</w:t>
+            </w:r>
+          </w:p>
+        </w:tc>
+        <w:tc>
+          <w:tcPr>
+            <w:tcW w:type="dxa" w:w="7030"/>
+          </w:tcPr>
+          <w:p>
+            <w:r/>
+            <w:r>
+              <w:rPr>
+                <w:sz w:val="18"/>
+              </w:rPr>
+              <w:t>Sesión 09 · Diferencias por plataforma y evidencia en iOS y Android</w:t>
+            </w:r>
+          </w:p>
+        </w:tc>
+      </w:tr>
+      <w:tr>
+        <w:tc>
+          <w:tcPr>
+            <w:tcW w:type="dxa" w:w="2381"/>
+            <w:shd w:val="clear" w:color="auto" w:fill="EAF2FA"/>
+          </w:tcPr>
+          <w:p>
+            <w:r/>
+            <w:r>
+              <w:rPr>
+                <w:b/>
+                <w:sz w:val="18"/>
+              </w:rPr>
               <w:t>Rama</w:t>
             </w:r>
           </w:p>
@@ -234,7 +266,7 @@
               <w:rPr>
                 <w:sz w:val="18"/>
               </w:rPr>
-              <w:t>feature/expect-actual-rodriguez</w:t>
+              <w:t>feature/expect-actual-rodriguez · https://github.com/fabianrodriguez33/Pharma-Mobil/tree/feature/expect-actual-rodriguez</w:t>
             </w:r>
           </w:p>
         </w:tc>
@@ -342,7 +374,7 @@
                 <w:color w:val="FFFFFF"/>
                 <w:sz w:val="17"/>
               </w:rPr>
-              <w:t>Mecanismo / declaración</w:t>
+              <w:t>Declaración (commonMain)</w:t>
             </w:r>
           </w:p>
         </w:tc>
@@ -359,7 +391,7 @@
                 <w:color w:val="FFFFFF"/>
                 <w:sz w:val="17"/>
               </w:rPr>
-              <w:t>Android</w:t>
+              <w:t>Android (androidMain)</w:t>
             </w:r>
           </w:p>
         </w:tc>
@@ -376,7 +408,7 @@
                 <w:color w:val="FFFFFF"/>
                 <w:sz w:val="17"/>
               </w:rPr>
-              <w:t>iOS</w:t>
+              <w:t>iOS (iosMain)</w:t>
             </w:r>
           </w:p>
         </w:tc>
@@ -406,7 +438,7 @@
               <w:rPr>
                 <w:sz w:val="17"/>
               </w:rPr>
-              <w:t>expect fun formatearSoles(valor: Double): String</w:t>
+              <w:t>expect fun formatearSoles(valor: Double): String · commonMain/.../platform/Formato.kt</w:t>
             </w:r>
           </w:p>
         </w:tc>
@@ -466,7 +498,7 @@
               <w:rPr>
                 <w:sz w:val="17"/>
               </w:rPr>
-              <w:t>interface Compartidor (domain) + Koin</w:t>
+              <w:t>interface Compartidor (domain) + Koin · commonMain/.../domain/platform/Compartidor.kt</w:t>
             </w:r>
           </w:p>
         </w:tc>
@@ -526,7 +558,7 @@
               <w:rPr>
                 <w:sz w:val="17"/>
               </w:rPr>
-              <w:t>expect class InfoDispositivo</w:t>
+              <w:t>expect class InfoDispositivo · commonMain/.../platform/InfoDispositivo.kt</w:t>
             </w:r>
           </w:p>
         </w:tc>
@@ -639,7 +671,7 @@
           <w:b w:val="0"/>
           <w:i w:val="0"/>
         </w:rPr>
-        <w:t>Si elimino Formato.ios.kt, la compilación del destino iOS falla con: «Expected declaration 'fun formatearSoles' has no actual declaration in module PharmaMobil.shared for Native». Es un error de compilación, no de ejecución: el proyecto no genera el framework hasta que exista el actual.</w:t>
+        <w:t>Para observarlo eliminé temporalmente Formato.android.kt y compilé con ./gradlew :shared:compileAndroidMain. El compilador respondió, literalmente: «e: file:///D:/DAM/pharmaMobil-master/shared/src/commonMain/kotlin/pe/edu/upeu/pharmamobil/platform/Formato.kt:7:1 Expected formatearSoles has no actual declaration in module &lt;commonMain&gt; for JVM» y la tarea terminó en BUILD FAILED (s09/compilador_falta_actual.log). Es un error de compilación, no de ejecución: el proyecto no genera el artefacto hasta que exista el actual. Restauré el archivo y el build volvió a pasar.</w:t>
       </w:r>
     </w:p>
     <w:p>
@@ -1452,6 +1484,18 @@
           <w:b w:val="0"/>
           <w:i w:val="0"/>
         </w:rPr>
+        <w:t>Mensaje del compilador sin el actual: ver pregunta 2 del Producto 2 (s09/compilador_falta_actual.log).</w:t>
+      </w:r>
+    </w:p>
+    <w:p>
+      <w:pPr>
+        <w:spacing w:after="80"/>
+      </w:pPr>
+      <w:r>
+        <w:rPr>
+          <w:b w:val="0"/>
+          <w:i w:val="0"/>
+        </w:rPr>
         <w:t>Capturas del emulador Pixel 8 (Android 17) contra el backend PharmaSoft real (10.0.2.2:8080):</w:t>
       </w:r>
     </w:p>

</xml_diff>